<commit_message>
Add Forex Analyst logo + preview backdrop, Jeff AI assistant
</commit_message>
<xml_diff>
--- a/Portfolio_Content.docx
+++ b/Portfolio_Content.docx
@@ -491,6 +491,30 @@
           <w:b/>
           <w:bCs/>
         </w:rPr>
+        <w:t xml:space="preserve">Logo filename (transparent PNG): </w:t>
+      </w:r>
+      <w:r>
+        <w:t xml:space="preserve"/>
+      </w:r>
+    </w:p>
+    <w:p>
+      <w:r>
+        <w:rPr>
+          <w:b/>
+          <w:bCs/>
+        </w:rPr>
+        <w:t xml:space="preserve">Backdrop / preview screenshot filename: </w:t>
+      </w:r>
+      <w:r>
+        <w:t xml:space="preserve"/>
+      </w:r>
+    </w:p>
+    <w:p>
+      <w:r>
+        <w:rPr>
+          <w:b/>
+          <w:bCs/>
+        </w:rPr>
         <w:t xml:space="preserve">Video (YouTube/Vimeo link or local filename): </w:t>
       </w:r>
       <w:r>
@@ -571,6 +595,186 @@
       </w:pPr>
       <w:r>
         <w:t xml:space="preserve">Case study ↗ — robotic-arm-case-study.html</w:t>
+      </w:r>
+    </w:p>
+    <w:p>
+      <w:r>
+        <w:t xml:space="preserve"/>
+      </w:r>
+    </w:p>
+    <w:p>
+      <w:pPr>
+        <w:pStyle w:val="Heading2"/>
+      </w:pPr>
+      <w:r>
+        <w:t xml:space="preserve">Project 2</w:t>
+      </w:r>
+    </w:p>
+    <w:p>
+      <w:r>
+        <w:rPr>
+          <w:b/>
+          <w:bCs/>
+        </w:rPr>
+        <w:t xml:space="preserve">Title: </w:t>
+      </w:r>
+      <w:r>
+        <w:t xml:space="preserve">Forex Analyst</w:t>
+      </w:r>
+    </w:p>
+    <w:p>
+      <w:r>
+        <w:rPr>
+          <w:b/>
+          <w:bCs/>
+        </w:rPr>
+        <w:t xml:space="preserve">Category: </w:t>
+      </w:r>
+      <w:r>
+        <w:t xml:space="preserve">Web</w:t>
+      </w:r>
+    </w:p>
+    <w:p>
+      <w:r>
+        <w:rPr>
+          <w:b/>
+          <w:bCs/>
+        </w:rPr>
+        <w:t xml:space="preserve">Year: </w:t>
+      </w:r>
+      <w:r>
+        <w:t xml:space="preserve">2026</w:t>
+      </w:r>
+    </w:p>
+    <w:p>
+      <w:r>
+        <w:rPr>
+          <w:b/>
+          <w:bCs/>
+        </w:rPr>
+        <w:t xml:space="preserve">Summary (one line): </w:t>
+      </w:r>
+      <w:r>
+        <w:t xml:space="preserve">Serverless FX research platform that computes live market analytics at the edge and publishes AI-written monthly reports at zero marginal cost.</w:t>
+      </w:r>
+    </w:p>
+    <w:p>
+      <w:r>
+        <w:rPr>
+          <w:b/>
+          <w:bCs/>
+        </w:rPr>
+        <w:t xml:space="preserve">Cover image filename: </w:t>
+      </w:r>
+      <w:r>
+        <w:t xml:space="preserve"/>
+      </w:r>
+    </w:p>
+    <w:p>
+      <w:r>
+        <w:rPr>
+          <w:b/>
+          <w:bCs/>
+        </w:rPr>
+        <w:t xml:space="preserve">Logo filename (transparent PNG): </w:t>
+      </w:r>
+      <w:r>
+        <w:t xml:space="preserve">FA-Logo-crop.png</w:t>
+      </w:r>
+    </w:p>
+    <w:p>
+      <w:r>
+        <w:rPr>
+          <w:b/>
+          <w:bCs/>
+        </w:rPr>
+        <w:t xml:space="preserve">Backdrop / preview screenshot filename: </w:t>
+      </w:r>
+      <w:r>
+        <w:t xml:space="preserve">FA-Preview.jpeg</w:t>
+      </w:r>
+    </w:p>
+    <w:p>
+      <w:r>
+        <w:rPr>
+          <w:b/>
+          <w:bCs/>
+        </w:rPr>
+        <w:t xml:space="preserve">Video (YouTube/Vimeo link or local filename): </w:t>
+      </w:r>
+      <w:r>
+        <w:t xml:space="preserve"/>
+      </w:r>
+    </w:p>
+    <w:p>
+      <w:r>
+        <w:rPr>
+          <w:b/>
+          <w:bCs/>
+        </w:rPr>
+        <w:t xml:space="preserve">Gallery image filenames (comma-separated): </w:t>
+      </w:r>
+      <w:r>
+        <w:t xml:space="preserve"/>
+      </w:r>
+    </w:p>
+    <w:p>
+      <w:r>
+        <w:rPr>
+          <w:i/>
+          <w:iCs/>
+          <w:color w:val="777777"/>
+        </w:rPr>
+        <w:t xml:space="preserve">Description (one or more paragraphs):</w:t>
+      </w:r>
+    </w:p>
+    <w:p>
+      <w:r>
+        <w:t xml:space="preserve">ForexAnalyst (forexanalyst.org) publishes institutional-style monthly research for six currency pairs — price action, technical indicators, macro drivers, and a forward outlook — presented with a minimal, Linear-inspired design.</w:t>
+      </w:r>
+    </w:p>
+    <w:p>
+      <w:r>
+        <w:t xml:space="preserve">The entire platform runs on a single Cloudflare Worker: it ingests daily OHLC data from Yahoo Finance, computes RSI, MACD, moving averages, market structure and pivot levels server-side, and renders interactive charts on the client. Monthly research notes are generated once by Claude with web-verified event data, then stored in Cloudflare KV and served as static editions — so visitors read AI research without triggering any per-request inference cost. Edge caching keeps market data fresh while holding third-party API usage near zero.</w:t>
+      </w:r>
+    </w:p>
+    <w:p>
+      <w:r>
+        <w:t xml:space="preserve">The project began as a Streamlit prototype and was re-engineered into a dependency-free vanilla JS frontend with a custom design system, deployed via a GitHub-to-Cloudflare CI pipeline on a custom domain.</w:t>
+      </w:r>
+    </w:p>
+    <w:p>
+      <w:r>
+        <w:rPr>
+          <w:b/>
+          <w:bCs/>
+        </w:rPr>
+        <w:t xml:space="preserve">Tags: </w:t>
+      </w:r>
+      <w:r>
+        <w:t xml:space="preserve">JavaScript, Cloudflare Workers, KV, Chart.js, Claude API, Serverless</w:t>
+      </w:r>
+    </w:p>
+    <w:p>
+      <w:r>
+        <w:rPr>
+          <w:i/>
+          <w:iCs/>
+          <w:color w:val="777777"/>
+        </w:rPr>
+        <w:t xml:space="preserve">Links (label — url), one per line:</w:t>
+      </w:r>
+    </w:p>
+    <w:p>
+      <w:pPr>
+        <w:pStyle w:val="ListParagraph"/>
+        <w:numPr>
+          <w:ilvl w:val="0"/>
+          <w:numId w:val="2"/>
+        </w:numPr>
+      </w:pPr>
+      <w:r>
+        <w:t xml:space="preserve">Visit forexanalyst.org ↗ — https://forexanalyst.org</w:t>
       </w:r>
     </w:p>
     <w:p>

</xml_diff>